<commit_message>
fix(templates): paper-form heritage cleanup + counselling follow-up signature placement
5 clinical templates: removed hardcoded 'Dr.' + Wingdings checkbox artifacts sitting next to docxtemplater placeholders. COUNSELLING_FOLLOW_UP: moved therapist name to Attending Therapist, patient address to Address, added consultant signature line.

Co-Authored-By: Claude Opus 4.8 (1M context) <noreply@anthropic.com>
</commit_message>
<xml_diff>
--- a/templates/COUNSELLING_FOLLOW_UP.docx
+++ b/templates/COUNSELLING_FOLLOW_UP.docx
@@ -280,7 +280,7 @@
           <w:b/>
           <w:bCs/>
         </w:rPr>
-        <w:t>Address: _____</w:t>
+        <w:t xml:space="preserve">Address: {{patient.address}}</w:t>
       </w:r>
       <w:r>
         <w:rPr>
@@ -288,7 +288,7 @@
           <w:b/>
           <w:bCs/>
         </w:rPr>
-        <w:t>_________</w:t>
+        <w:t/>
       </w:r>
       <w:r>
         <w:rPr>
@@ -296,7 +296,7 @@
           <w:b/>
           <w:bCs/>
         </w:rPr>
-        <w:t>{{therapist.name}}____________________</w:t>
+        <w:t/>
       </w:r>
       <w:bookmarkStart w:id="0" w:name="_Hlk222318395"/>
       <w:r>
@@ -355,7 +355,7 @@
         <w:rPr>
           <w:rFonts w:ascii="Times New Roman" w:hAnsi="Times New Roman" w:cs="Times New Roman"/>
         </w:rPr>
-        <w:t>____________</w:t>
+        <w:t xml:space="preserve">{{therapist.name}}    </w:t>
       </w:r>
       <w:r>
         <w:rPr>
@@ -363,7 +363,7 @@
           <w:b/>
           <w:bCs/>
         </w:rPr>
-        <w:t xml:space="preserve">________________ </w:t>
+        <w:t xml:space="preserve">{{%consultantSignature}}</w:t>
       </w:r>
     </w:p>
     <w:p>

</xml_diff>